<commit_message>
Update 2-Make a flying obstacle prefab.docx
</commit_message>
<xml_diff>
--- a/Unit 3 - 2D SpriteFlight/2-Make a flying obstacle prefab.docx
+++ b/Unit 3 - 2D SpriteFlight/2-Make a flying obstacle prefab.docx
@@ -1289,11 +1289,6 @@
       </w:r>
     </w:p>
     <w:p>
-      <w:r>
-        <w:t>Mark step incomplete</w:t>
-      </w:r>
-    </w:p>
-    <w:p>
       <w:pPr>
         <w:rPr>
           <w:b/>
@@ -1310,15 +1305,6 @@
     </w:p>
     <w:p>
       <w:r>
-        <w:rPr>
-          <w:b/>
-          <w:bCs/>
-        </w:rPr>
-        <w:t>Q&amp;A (0)</w:t>
-      </w:r>
-    </w:p>
-    <w:p>
-      <w:r>
         <w:t>So far, gravity has been pulling your obstacle downward. But what happens if there’s no gravity at all? In this step, you’ll experiment with changing the </w:t>
       </w:r>
       <w:r>
@@ -1384,16 +1370,10 @@
     </w:p>
     <w:p>
       <w:r>
-        <w:t>Play Video</w:t>
-      </w:r>
-    </w:p>
-    <w:p>
-      <w:r>
-        <w:rPr>
-          <w:b/>
-          <w:bCs/>
-        </w:rPr>
-        <w:lastRenderedPageBreak/>
+        <w:rPr>
+          <w:b/>
+          <w:bCs/>
+        </w:rPr>
         <w:t>1. Play the scene and pause while the obstacle falls:</w:t>
       </w:r>
     </w:p>
@@ -1426,6 +1406,7 @@
         </w:numPr>
       </w:pPr>
       <w:r>
+        <w:lastRenderedPageBreak/>
         <w:t>Wait for the obstacle to begin falling, then select the </w:t>
       </w:r>
       <w:r>
@@ -1632,11 +1613,6 @@
       </w:r>
     </w:p>
     <w:p>
-      <w:r>
-        <w:t>Mark step incomplete</w:t>
-      </w:r>
-    </w:p>
-    <w:p>
       <w:pPr>
         <w:rPr>
           <w:b/>
@@ -1653,15 +1629,6 @@
     </w:p>
     <w:p>
       <w:r>
-        <w:rPr>
-          <w:b/>
-          <w:bCs/>
-        </w:rPr>
-        <w:t>Q&amp;A (0)</w:t>
-      </w:r>
-    </w:p>
-    <w:p>
-      <w:r>
         <w:t>Now that your obstacle behaves the way you want, it’s time to turn it into a prefab. A </w:t>
       </w:r>
       <w:r>
@@ -1678,11 +1645,6 @@
     <w:p>
       <w:r>
         <w:t>This step introduces a major Unity workflow: designing in the scene, saving as a prefab, and then reusing that prefab throughout the game.</w:t>
-      </w:r>
-    </w:p>
-    <w:p>
-      <w:r>
-        <w:t>Play Video</w:t>
       </w:r>
     </w:p>
     <w:p>
@@ -1814,7 +1776,6 @@
         </w:numPr>
       </w:pPr>
       <w:r>
-        <w:lastRenderedPageBreak/>
         <w:t>Notice how the </w:t>
       </w:r>
       <w:r>
@@ -1937,6 +1898,7 @@
         </w:numPr>
       </w:pPr>
       <w:r>
+        <w:lastRenderedPageBreak/>
         <w:t>Select the </w:t>
       </w:r>
       <w:r>
@@ -1966,11 +1928,6 @@
       </w:r>
     </w:p>
     <w:p>
-      <w:r>
-        <w:t>Mark step incomplete</w:t>
-      </w:r>
-    </w:p>
-    <w:p>
       <w:pPr>
         <w:rPr>
           <w:b/>
@@ -1983,15 +1940,6 @@
           <w:bCs/>
         </w:rPr>
         <w:t>7. Organize the Hierarchy window</w:t>
-      </w:r>
-    </w:p>
-    <w:p>
-      <w:r>
-        <w:rPr>
-          <w:b/>
-          <w:bCs/>
-        </w:rPr>
-        <w:t>Q&amp;A (0)</w:t>
       </w:r>
     </w:p>
     <w:p>
@@ -2235,42 +2183,18 @@
       </w:r>
     </w:p>
     <w:p>
-      <w:r>
-        <w:t>Mark step incomplete</w:t>
-      </w:r>
-    </w:p>
-    <w:p>
-      <w:r>
-        <w:rPr>
-          <w:b/>
-          <w:bCs/>
-        </w:rPr>
-        <w:t>Optional step</w:t>
-      </w:r>
-    </w:p>
-    <w:p>
-      <w:pPr>
-        <w:rPr>
-          <w:b/>
-          <w:bCs/>
-        </w:rPr>
-      </w:pPr>
-      <w:r>
-        <w:rPr>
-          <w:b/>
-          <w:bCs/>
-        </w:rPr>
-        <w:lastRenderedPageBreak/>
+      <w:pPr>
+        <w:rPr>
+          <w:b/>
+          <w:bCs/>
+        </w:rPr>
+      </w:pPr>
+      <w:r>
+        <w:rPr>
+          <w:b/>
+          <w:bCs/>
+        </w:rPr>
         <w:t>8. Optional: More things to try</w:t>
-      </w:r>
-    </w:p>
-    <w:p>
-      <w:r>
-        <w:rPr>
-          <w:b/>
-          <w:bCs/>
-        </w:rPr>
-        <w:t>Q&amp;A (0)</w:t>
       </w:r>
     </w:p>
     <w:p>

</xml_diff>